<commit_message>
Organize intermediate experiment artifacts into artifacts/ directory
</commit_message>
<xml_diff>
--- a/docs/技术报告.docx
+++ b/docs/技术报告.docx
@@ -17182,7 +17182,7 @@
           <w:sz w:val="19"/>
           <w:shd w:val="clear" w:color="auto" w:fill="F2F2F2"/>
         </w:rPr>
-        <w:t>scan_final_summary_table.tsv</w:t>
+        <w:t>artifacts/ablation_scan_results/scan_final_summary_table.tsv</w:t>
       </w:r>
       <w:r>
         <w:rPr>
@@ -34111,7 +34111,7 @@
           <w:sz w:val="19"/>
           <w:shd w:val="clear" w:color="auto" w:fill="F2F2F2"/>
         </w:rPr>
-        <w:t>scan_final_summary_table.tsv</w:t>
+        <w:t>artifacts/ablation_scan_results/scan_final_summary_table.tsv</w:t>
       </w:r>
     </w:p>
     <w:p>

</xml_diff>

<commit_message>
Complete repository evidence and integrity audit
</commit_message>
<xml_diff>
--- a/docs/技术报告.docx
+++ b/docs/技术报告.docx
@@ -288,7 +288,7 @@
       <w:r>
         <w:fldChar w:fldCharType="separate"/>
       </w:r>
-      <w:hyperlink w:anchor="_Toc235105728" w:history="1">
+      <w:hyperlink w:anchor="_Toc235197772" w:history="1">
         <w:r>
           <w:rPr>
             <w:rStyle w:val="ae"/>
@@ -325,7 +325,7 @@
             <w:noProof/>
             <w:webHidden/>
           </w:rPr>
-          <w:instrText>PAGEREF _Toc235105728 \h</w:instrText>
+          <w:instrText>PAGEREF _Toc235197772 \h</w:instrText>
         </w:r>
         <w:r>
           <w:rPr>
@@ -379,7 +379,7 @@
           <w:sz w:val="22"/>
         </w:rPr>
       </w:pPr>
-      <w:hyperlink w:anchor="_Toc235105729" w:history="1">
+      <w:hyperlink w:anchor="_Toc235197773" w:history="1">
         <w:r>
           <w:rPr>
             <w:rStyle w:val="ae"/>
@@ -430,7 +430,7 @@
             <w:noProof/>
             <w:webHidden/>
           </w:rPr>
-          <w:instrText>PAGEREF _Toc235105729 \h</w:instrText>
+          <w:instrText>PAGEREF _Toc235197773 \h</w:instrText>
         </w:r>
         <w:r>
           <w:rPr>
@@ -485,7 +485,7 @@
           <w:sz w:val="22"/>
         </w:rPr>
       </w:pPr>
-      <w:hyperlink w:anchor="_Toc235105730" w:history="1">
+      <w:hyperlink w:anchor="_Toc235197774" w:history="1">
         <w:r>
           <w:rPr>
             <w:rStyle w:val="ae"/>
@@ -529,7 +529,7 @@
             <w:noProof/>
             <w:webHidden/>
           </w:rPr>
-          <w:instrText>PAGEREF _Toc235105730 \h</w:instrText>
+          <w:instrText>PAGEREF _Toc235197774 \h</w:instrText>
         </w:r>
         <w:r>
           <w:rPr>
@@ -584,7 +584,7 @@
           <w:sz w:val="22"/>
         </w:rPr>
       </w:pPr>
-      <w:hyperlink w:anchor="_Toc235105731" w:history="1">
+      <w:hyperlink w:anchor="_Toc235197775" w:history="1">
         <w:r>
           <w:rPr>
             <w:rStyle w:val="ae"/>
@@ -628,7 +628,7 @@
             <w:noProof/>
             <w:webHidden/>
           </w:rPr>
-          <w:instrText>PAGEREF _Toc235105731 \h</w:instrText>
+          <w:instrText>PAGEREF _Toc235197775 \h</w:instrText>
         </w:r>
         <w:r>
           <w:rPr>
@@ -683,7 +683,7 @@
           <w:sz w:val="22"/>
         </w:rPr>
       </w:pPr>
-      <w:hyperlink w:anchor="_Toc235105732" w:history="1">
+      <w:hyperlink w:anchor="_Toc235197776" w:history="1">
         <w:r>
           <w:rPr>
             <w:rStyle w:val="ae"/>
@@ -727,7 +727,7 @@
             <w:noProof/>
             <w:webHidden/>
           </w:rPr>
-          <w:instrText>PAGEREF _Toc235105732 \h</w:instrText>
+          <w:instrText>PAGEREF _Toc235197776 \h</w:instrText>
         </w:r>
         <w:r>
           <w:rPr>
@@ -781,7 +781,7 @@
           <w:sz w:val="22"/>
         </w:rPr>
       </w:pPr>
-      <w:hyperlink w:anchor="_Toc235105733" w:history="1">
+      <w:hyperlink w:anchor="_Toc235197777" w:history="1">
         <w:r>
           <w:rPr>
             <w:rStyle w:val="ae"/>
@@ -832,7 +832,7 @@
             <w:noProof/>
             <w:webHidden/>
           </w:rPr>
-          <w:instrText>PAGEREF _Toc235105733 \h</w:instrText>
+          <w:instrText>PAGEREF _Toc235197777 \h</w:instrText>
         </w:r>
         <w:r>
           <w:rPr>
@@ -887,7 +887,7 @@
           <w:sz w:val="22"/>
         </w:rPr>
       </w:pPr>
-      <w:hyperlink w:anchor="_Toc235105734" w:history="1">
+      <w:hyperlink w:anchor="_Toc235197778" w:history="1">
         <w:r>
           <w:rPr>
             <w:rStyle w:val="ae"/>
@@ -931,7 +931,7 @@
             <w:noProof/>
             <w:webHidden/>
           </w:rPr>
-          <w:instrText>PAGEREF _Toc235105734 \h</w:instrText>
+          <w:instrText>PAGEREF _Toc235197778 \h</w:instrText>
         </w:r>
         <w:r>
           <w:rPr>
@@ -986,7 +986,7 @@
           <w:sz w:val="22"/>
         </w:rPr>
       </w:pPr>
-      <w:hyperlink w:anchor="_Toc235105735" w:history="1">
+      <w:hyperlink w:anchor="_Toc235197779" w:history="1">
         <w:r>
           <w:rPr>
             <w:rStyle w:val="ae"/>
@@ -1030,7 +1030,7 @@
             <w:noProof/>
             <w:webHidden/>
           </w:rPr>
-          <w:instrText>PAGEREF _Toc235105735 \h</w:instrText>
+          <w:instrText>PAGEREF _Toc235197779 \h</w:instrText>
         </w:r>
         <w:r>
           <w:rPr>
@@ -1085,7 +1085,7 @@
           <w:sz w:val="22"/>
         </w:rPr>
       </w:pPr>
-      <w:hyperlink w:anchor="_Toc235105736" w:history="1">
+      <w:hyperlink w:anchor="_Toc235197780" w:history="1">
         <w:r>
           <w:rPr>
             <w:rStyle w:val="ae"/>
@@ -1129,7 +1129,7 @@
             <w:noProof/>
             <w:webHidden/>
           </w:rPr>
-          <w:instrText>PAGEREF _Toc235105736 \h</w:instrText>
+          <w:instrText>PAGEREF _Toc235197780 \h</w:instrText>
         </w:r>
         <w:r>
           <w:rPr>
@@ -1184,7 +1184,7 @@
           <w:sz w:val="22"/>
         </w:rPr>
       </w:pPr>
-      <w:hyperlink w:anchor="_Toc235105737" w:history="1">
+      <w:hyperlink w:anchor="_Toc235197781" w:history="1">
         <w:r>
           <w:rPr>
             <w:rStyle w:val="ae"/>
@@ -1228,7 +1228,7 @@
             <w:noProof/>
             <w:webHidden/>
           </w:rPr>
-          <w:instrText>PAGEREF _Toc235105737 \h</w:instrText>
+          <w:instrText>PAGEREF _Toc235197781 \h</w:instrText>
         </w:r>
         <w:r>
           <w:rPr>
@@ -1283,7 +1283,7 @@
           <w:sz w:val="22"/>
         </w:rPr>
       </w:pPr>
-      <w:hyperlink w:anchor="_Toc235105738" w:history="1">
+      <w:hyperlink w:anchor="_Toc235197782" w:history="1">
         <w:r>
           <w:rPr>
             <w:rStyle w:val="ae"/>
@@ -1327,7 +1327,7 @@
             <w:noProof/>
             <w:webHidden/>
           </w:rPr>
-          <w:instrText>PAGEREF _Toc235105738 \h</w:instrText>
+          <w:instrText>PAGEREF _Toc235197782 \h</w:instrText>
         </w:r>
         <w:r>
           <w:rPr>
@@ -1382,7 +1382,7 @@
           <w:sz w:val="22"/>
         </w:rPr>
       </w:pPr>
-      <w:hyperlink w:anchor="_Toc235105739" w:history="1">
+      <w:hyperlink w:anchor="_Toc235197783" w:history="1">
         <w:r>
           <w:rPr>
             <w:rStyle w:val="ae"/>
@@ -1426,7 +1426,7 @@
             <w:noProof/>
             <w:webHidden/>
           </w:rPr>
-          <w:instrText>PAGEREF _Toc235105739 \h</w:instrText>
+          <w:instrText>PAGEREF _Toc235197783 \h</w:instrText>
         </w:r>
         <w:r>
           <w:rPr>
@@ -1481,7 +1481,7 @@
           <w:sz w:val="22"/>
         </w:rPr>
       </w:pPr>
-      <w:hyperlink w:anchor="_Toc235105740" w:history="1">
+      <w:hyperlink w:anchor="_Toc235197784" w:history="1">
         <w:r>
           <w:rPr>
             <w:rStyle w:val="ae"/>
@@ -1525,7 +1525,7 @@
             <w:noProof/>
             <w:webHidden/>
           </w:rPr>
-          <w:instrText>PAGEREF _Toc235105740 \h</w:instrText>
+          <w:instrText>PAGEREF _Toc235197784 \h</w:instrText>
         </w:r>
         <w:r>
           <w:rPr>
@@ -1580,7 +1580,7 @@
           <w:sz w:val="22"/>
         </w:rPr>
       </w:pPr>
-      <w:hyperlink w:anchor="_Toc235105741" w:history="1">
+      <w:hyperlink w:anchor="_Toc235197785" w:history="1">
         <w:r>
           <w:rPr>
             <w:rStyle w:val="ae"/>
@@ -1624,7 +1624,7 @@
             <w:noProof/>
             <w:webHidden/>
           </w:rPr>
-          <w:instrText>PAGEREF _Toc235105741 \h</w:instrText>
+          <w:instrText>PAGEREF _Toc235197785 \h</w:instrText>
         </w:r>
         <w:r>
           <w:rPr>
@@ -1679,7 +1679,7 @@
           <w:sz w:val="22"/>
         </w:rPr>
       </w:pPr>
-      <w:hyperlink w:anchor="_Toc235105742" w:history="1">
+      <w:hyperlink w:anchor="_Toc235197786" w:history="1">
         <w:r>
           <w:rPr>
             <w:rStyle w:val="ae"/>
@@ -1723,7 +1723,7 @@
             <w:noProof/>
             <w:webHidden/>
           </w:rPr>
-          <w:instrText>PAGEREF _Toc235105742 \h</w:instrText>
+          <w:instrText>PAGEREF _Toc235197786 \h</w:instrText>
         </w:r>
         <w:r>
           <w:rPr>
@@ -1778,7 +1778,7 @@
           <w:sz w:val="22"/>
         </w:rPr>
       </w:pPr>
-      <w:hyperlink w:anchor="_Toc235105743" w:history="1">
+      <w:hyperlink w:anchor="_Toc235197787" w:history="1">
         <w:r>
           <w:rPr>
             <w:rStyle w:val="ae"/>
@@ -1822,7 +1822,7 @@
             <w:noProof/>
             <w:webHidden/>
           </w:rPr>
-          <w:instrText>PAGEREF _Toc235105743 \h</w:instrText>
+          <w:instrText>PAGEREF _Toc235197787 \h</w:instrText>
         </w:r>
         <w:r>
           <w:rPr>
@@ -1876,7 +1876,7 @@
           <w:sz w:val="22"/>
         </w:rPr>
       </w:pPr>
-      <w:hyperlink w:anchor="_Toc235105744" w:history="1">
+      <w:hyperlink w:anchor="_Toc235197788" w:history="1">
         <w:r>
           <w:rPr>
             <w:rStyle w:val="ae"/>
@@ -1927,7 +1927,7 @@
             <w:noProof/>
             <w:webHidden/>
           </w:rPr>
-          <w:instrText>PAGEREF _Toc235105744 \h</w:instrText>
+          <w:instrText>PAGEREF _Toc235197788 \h</w:instrText>
         </w:r>
         <w:r>
           <w:rPr>
@@ -1982,7 +1982,7 @@
           <w:sz w:val="22"/>
         </w:rPr>
       </w:pPr>
-      <w:hyperlink w:anchor="_Toc235105745" w:history="1">
+      <w:hyperlink w:anchor="_Toc235197789" w:history="1">
         <w:r>
           <w:rPr>
             <w:rStyle w:val="ae"/>
@@ -2040,7 +2040,7 @@
             <w:noProof/>
             <w:webHidden/>
           </w:rPr>
-          <w:instrText>PAGEREF _Toc235105745 \h</w:instrText>
+          <w:instrText>PAGEREF _Toc235197789 \h</w:instrText>
         </w:r>
         <w:r>
           <w:rPr>
@@ -2095,7 +2095,7 @@
           <w:sz w:val="22"/>
         </w:rPr>
       </w:pPr>
-      <w:hyperlink w:anchor="_Toc235105746" w:history="1">
+      <w:hyperlink w:anchor="_Toc235197790" w:history="1">
         <w:r>
           <w:rPr>
             <w:rStyle w:val="ae"/>
@@ -2153,7 +2153,7 @@
             <w:noProof/>
             <w:webHidden/>
           </w:rPr>
-          <w:instrText>PAGEREF _Toc235105746 \h</w:instrText>
+          <w:instrText>PAGEREF _Toc235197790 \h</w:instrText>
         </w:r>
         <w:r>
           <w:rPr>
@@ -2208,7 +2208,7 @@
           <w:sz w:val="22"/>
         </w:rPr>
       </w:pPr>
-      <w:hyperlink w:anchor="_Toc235105747" w:history="1">
+      <w:hyperlink w:anchor="_Toc235197791" w:history="1">
         <w:r>
           <w:rPr>
             <w:rStyle w:val="ae"/>
@@ -2266,7 +2266,7 @@
             <w:noProof/>
             <w:webHidden/>
           </w:rPr>
-          <w:instrText>PAGEREF _Toc235105747 \h</w:instrText>
+          <w:instrText>PAGEREF _Toc235197791 \h</w:instrText>
         </w:r>
         <w:r>
           <w:rPr>
@@ -2321,7 +2321,7 @@
           <w:sz w:val="22"/>
         </w:rPr>
       </w:pPr>
-      <w:hyperlink w:anchor="_Toc235105748" w:history="1">
+      <w:hyperlink w:anchor="_Toc235197792" w:history="1">
         <w:r>
           <w:rPr>
             <w:rStyle w:val="ae"/>
@@ -2365,7 +2365,7 @@
             <w:noProof/>
             <w:webHidden/>
           </w:rPr>
-          <w:instrText>PAGEREF _Toc235105748 \h</w:instrText>
+          <w:instrText>PAGEREF _Toc235197792 \h</w:instrText>
         </w:r>
         <w:r>
           <w:rPr>
@@ -2420,7 +2420,7 @@
           <w:sz w:val="22"/>
         </w:rPr>
       </w:pPr>
-      <w:hyperlink w:anchor="_Toc235105749" w:history="1">
+      <w:hyperlink w:anchor="_Toc235197793" w:history="1">
         <w:r>
           <w:rPr>
             <w:rStyle w:val="ae"/>
@@ -2464,7 +2464,7 @@
             <w:noProof/>
             <w:webHidden/>
           </w:rPr>
-          <w:instrText>PAGEREF _Toc235105749 \h</w:instrText>
+          <w:instrText>PAGEREF _Toc235197793 \h</w:instrText>
         </w:r>
         <w:r>
           <w:rPr>
@@ -2519,7 +2519,7 @@
           <w:sz w:val="22"/>
         </w:rPr>
       </w:pPr>
-      <w:hyperlink w:anchor="_Toc235105750" w:history="1">
+      <w:hyperlink w:anchor="_Toc235197794" w:history="1">
         <w:r>
           <w:rPr>
             <w:rStyle w:val="ae"/>
@@ -2563,7 +2563,7 @@
             <w:noProof/>
             <w:webHidden/>
           </w:rPr>
-          <w:instrText>PAGEREF _Toc235105750 \h</w:instrText>
+          <w:instrText>PAGEREF _Toc235197794 \h</w:instrText>
         </w:r>
         <w:r>
           <w:rPr>
@@ -2618,7 +2618,7 @@
           <w:sz w:val="22"/>
         </w:rPr>
       </w:pPr>
-      <w:hyperlink w:anchor="_Toc235105751" w:history="1">
+      <w:hyperlink w:anchor="_Toc235197795" w:history="1">
         <w:r>
           <w:rPr>
             <w:rStyle w:val="ae"/>
@@ -2662,7 +2662,7 @@
             <w:noProof/>
             <w:webHidden/>
           </w:rPr>
-          <w:instrText>PAGEREF _Toc235105751 \h</w:instrText>
+          <w:instrText>PAGEREF _Toc235197795 \h</w:instrText>
         </w:r>
         <w:r>
           <w:rPr>
@@ -2717,7 +2717,7 @@
           <w:sz w:val="22"/>
         </w:rPr>
       </w:pPr>
-      <w:hyperlink w:anchor="_Toc235105752" w:history="1">
+      <w:hyperlink w:anchor="_Toc235197796" w:history="1">
         <w:r>
           <w:rPr>
             <w:rStyle w:val="ae"/>
@@ -2761,7 +2761,7 @@
             <w:noProof/>
             <w:webHidden/>
           </w:rPr>
-          <w:instrText>PAGEREF _Toc235105752 \h</w:instrText>
+          <w:instrText>PAGEREF _Toc235197796 \h</w:instrText>
         </w:r>
         <w:r>
           <w:rPr>
@@ -2816,7 +2816,7 @@
           <w:sz w:val="22"/>
         </w:rPr>
       </w:pPr>
-      <w:hyperlink w:anchor="_Toc235105753" w:history="1">
+      <w:hyperlink w:anchor="_Toc235197797" w:history="1">
         <w:r>
           <w:rPr>
             <w:rStyle w:val="ae"/>
@@ -2860,7 +2860,7 @@
             <w:noProof/>
             <w:webHidden/>
           </w:rPr>
-          <w:instrText>PAGEREF _Toc235105753 \h</w:instrText>
+          <w:instrText>PAGEREF _Toc235197797 \h</w:instrText>
         </w:r>
         <w:r>
           <w:rPr>
@@ -2915,7 +2915,7 @@
           <w:sz w:val="22"/>
         </w:rPr>
       </w:pPr>
-      <w:hyperlink w:anchor="_Toc235105754" w:history="1">
+      <w:hyperlink w:anchor="_Toc235197798" w:history="1">
         <w:r>
           <w:rPr>
             <w:rStyle w:val="ae"/>
@@ -2973,7 +2973,7 @@
             <w:noProof/>
             <w:webHidden/>
           </w:rPr>
-          <w:instrText>PAGEREF _Toc235105754 \h</w:instrText>
+          <w:instrText>PAGEREF _Toc235197798 \h</w:instrText>
         </w:r>
         <w:r>
           <w:rPr>
@@ -3028,7 +3028,7 @@
           <w:sz w:val="22"/>
         </w:rPr>
       </w:pPr>
-      <w:hyperlink w:anchor="_Toc235105755" w:history="1">
+      <w:hyperlink w:anchor="_Toc235197799" w:history="1">
         <w:r>
           <w:rPr>
             <w:rStyle w:val="ae"/>
@@ -3072,7 +3072,7 @@
             <w:noProof/>
             <w:webHidden/>
           </w:rPr>
-          <w:instrText>PAGEREF _Toc235105755 \h</w:instrText>
+          <w:instrText>PAGEREF _Toc235197799 \h</w:instrText>
         </w:r>
         <w:r>
           <w:rPr>
@@ -3126,7 +3126,7 @@
           <w:sz w:val="22"/>
         </w:rPr>
       </w:pPr>
-      <w:hyperlink w:anchor="_Toc235105756" w:history="1">
+      <w:hyperlink w:anchor="_Toc235197800" w:history="1">
         <w:r>
           <w:rPr>
             <w:rStyle w:val="ae"/>
@@ -3177,7 +3177,7 @@
             <w:noProof/>
             <w:webHidden/>
           </w:rPr>
-          <w:instrText>PAGEREF _Toc235105756 \h</w:instrText>
+          <w:instrText>PAGEREF _Toc235197800 \h</w:instrText>
         </w:r>
         <w:r>
           <w:rPr>
@@ -3232,7 +3232,7 @@
           <w:sz w:val="22"/>
         </w:rPr>
       </w:pPr>
-      <w:hyperlink w:anchor="_Toc235105757" w:history="1">
+      <w:hyperlink w:anchor="_Toc235197801" w:history="1">
         <w:r>
           <w:rPr>
             <w:rStyle w:val="ae"/>
@@ -3276,7 +3276,7 @@
             <w:noProof/>
             <w:webHidden/>
           </w:rPr>
-          <w:instrText>PAGEREF _Toc235105757 \h</w:instrText>
+          <w:instrText>PAGEREF _Toc235197801 \h</w:instrText>
         </w:r>
         <w:r>
           <w:rPr>
@@ -3331,7 +3331,7 @@
           <w:sz w:val="22"/>
         </w:rPr>
       </w:pPr>
-      <w:hyperlink w:anchor="_Toc235105758" w:history="1">
+      <w:hyperlink w:anchor="_Toc235197802" w:history="1">
         <w:r>
           <w:rPr>
             <w:rStyle w:val="ae"/>
@@ -3375,7 +3375,7 @@
             <w:noProof/>
             <w:webHidden/>
           </w:rPr>
-          <w:instrText>PAGEREF _Toc235105758 \h</w:instrText>
+          <w:instrText>PAGEREF _Toc235197802 \h</w:instrText>
         </w:r>
         <w:r>
           <w:rPr>
@@ -3430,7 +3430,7 @@
           <w:sz w:val="22"/>
         </w:rPr>
       </w:pPr>
-      <w:hyperlink w:anchor="_Toc235105759" w:history="1">
+      <w:hyperlink w:anchor="_Toc235197803" w:history="1">
         <w:r>
           <w:rPr>
             <w:rStyle w:val="ae"/>
@@ -3474,7 +3474,7 @@
             <w:noProof/>
             <w:webHidden/>
           </w:rPr>
-          <w:instrText>PAGEREF _Toc235105759 \h</w:instrText>
+          <w:instrText>PAGEREF _Toc235197803 \h</w:instrText>
         </w:r>
         <w:r>
           <w:rPr>
@@ -3529,7 +3529,7 @@
           <w:sz w:val="22"/>
         </w:rPr>
       </w:pPr>
-      <w:hyperlink w:anchor="_Toc235105760" w:history="1">
+      <w:hyperlink w:anchor="_Toc235197804" w:history="1">
         <w:r>
           <w:rPr>
             <w:rStyle w:val="ae"/>
@@ -3573,7 +3573,7 @@
             <w:noProof/>
             <w:webHidden/>
           </w:rPr>
-          <w:instrText>PAGEREF _Toc235105760 \h</w:instrText>
+          <w:instrText>PAGEREF _Toc235197804 \h</w:instrText>
         </w:r>
         <w:r>
           <w:rPr>
@@ -3628,7 +3628,7 @@
           <w:sz w:val="22"/>
         </w:rPr>
       </w:pPr>
-      <w:hyperlink w:anchor="_Toc235105761" w:history="1">
+      <w:hyperlink w:anchor="_Toc235197805" w:history="1">
         <w:r>
           <w:rPr>
             <w:rStyle w:val="ae"/>
@@ -3672,7 +3672,7 @@
             <w:noProof/>
             <w:webHidden/>
           </w:rPr>
-          <w:instrText>PAGEREF _Toc235105761 \h</w:instrText>
+          <w:instrText>PAGEREF _Toc235197805 \h</w:instrText>
         </w:r>
         <w:r>
           <w:rPr>
@@ -3727,7 +3727,7 @@
           <w:sz w:val="22"/>
         </w:rPr>
       </w:pPr>
-      <w:hyperlink w:anchor="_Toc235105762" w:history="1">
+      <w:hyperlink w:anchor="_Toc235197806" w:history="1">
         <w:r>
           <w:rPr>
             <w:rStyle w:val="ae"/>
@@ -3771,7 +3771,7 @@
             <w:noProof/>
             <w:webHidden/>
           </w:rPr>
-          <w:instrText>PAGEREF _Toc235105762 \h</w:instrText>
+          <w:instrText>PAGEREF _Toc235197806 \h</w:instrText>
         </w:r>
         <w:r>
           <w:rPr>
@@ -3826,7 +3826,7 @@
           <w:sz w:val="22"/>
         </w:rPr>
       </w:pPr>
-      <w:hyperlink w:anchor="_Toc235105763" w:history="1">
+      <w:hyperlink w:anchor="_Toc235197807" w:history="1">
         <w:r>
           <w:rPr>
             <w:rStyle w:val="ae"/>
@@ -3870,7 +3870,7 @@
             <w:noProof/>
             <w:webHidden/>
           </w:rPr>
-          <w:instrText>PAGEREF _Toc235105763 \h</w:instrText>
+          <w:instrText>PAGEREF _Toc235197807 \h</w:instrText>
         </w:r>
         <w:r>
           <w:rPr>
@@ -3925,7 +3925,7 @@
           <w:sz w:val="22"/>
         </w:rPr>
       </w:pPr>
-      <w:hyperlink w:anchor="_Toc235105764" w:history="1">
+      <w:hyperlink w:anchor="_Toc235197808" w:history="1">
         <w:r>
           <w:rPr>
             <w:rStyle w:val="ae"/>
@@ -3969,7 +3969,7 @@
             <w:noProof/>
             <w:webHidden/>
           </w:rPr>
-          <w:instrText>PAGEREF _Toc235105764 \h</w:instrText>
+          <w:instrText>PAGEREF _Toc235197808 \h</w:instrText>
         </w:r>
         <w:r>
           <w:rPr>
@@ -4023,7 +4023,7 @@
           <w:sz w:val="22"/>
         </w:rPr>
       </w:pPr>
-      <w:hyperlink w:anchor="_Toc235105765" w:history="1">
+      <w:hyperlink w:anchor="_Toc235197809" w:history="1">
         <w:r>
           <w:rPr>
             <w:rStyle w:val="ae"/>
@@ -4074,7 +4074,7 @@
             <w:noProof/>
             <w:webHidden/>
           </w:rPr>
-          <w:instrText>PAGEREF _Toc235105765 \h</w:instrText>
+          <w:instrText>PAGEREF _Toc235197809 \h</w:instrText>
         </w:r>
         <w:r>
           <w:rPr>
@@ -4129,7 +4129,7 @@
           <w:sz w:val="22"/>
         </w:rPr>
       </w:pPr>
-      <w:hyperlink w:anchor="_Toc235105766" w:history="1">
+      <w:hyperlink w:anchor="_Toc235197810" w:history="1">
         <w:r>
           <w:rPr>
             <w:rStyle w:val="ae"/>
@@ -4173,7 +4173,7 @@
             <w:noProof/>
             <w:webHidden/>
           </w:rPr>
-          <w:instrText>PAGEREF _Toc235105766 \h</w:instrText>
+          <w:instrText>PAGEREF _Toc235197810 \h</w:instrText>
         </w:r>
         <w:r>
           <w:rPr>
@@ -4228,7 +4228,7 @@
           <w:sz w:val="22"/>
         </w:rPr>
       </w:pPr>
-      <w:hyperlink w:anchor="_Toc235105767" w:history="1">
+      <w:hyperlink w:anchor="_Toc235197811" w:history="1">
         <w:r>
           <w:rPr>
             <w:rStyle w:val="ae"/>
@@ -4272,7 +4272,7 @@
             <w:noProof/>
             <w:webHidden/>
           </w:rPr>
-          <w:instrText>PAGEREF _Toc235105767 \h</w:instrText>
+          <w:instrText>PAGEREF _Toc235197811 \h</w:instrText>
         </w:r>
         <w:r>
           <w:rPr>
@@ -4327,7 +4327,7 @@
           <w:sz w:val="22"/>
         </w:rPr>
       </w:pPr>
-      <w:hyperlink w:anchor="_Toc235105768" w:history="1">
+      <w:hyperlink w:anchor="_Toc235197812" w:history="1">
         <w:r>
           <w:rPr>
             <w:rStyle w:val="ae"/>
@@ -4371,7 +4371,7 @@
             <w:noProof/>
             <w:webHidden/>
           </w:rPr>
-          <w:instrText>PAGEREF _Toc235105768 \h</w:instrText>
+          <w:instrText>PAGEREF _Toc235197812 \h</w:instrText>
         </w:r>
         <w:r>
           <w:rPr>
@@ -4426,7 +4426,7 @@
           <w:sz w:val="22"/>
         </w:rPr>
       </w:pPr>
-      <w:hyperlink w:anchor="_Toc235105769" w:history="1">
+      <w:hyperlink w:anchor="_Toc235197813" w:history="1">
         <w:r>
           <w:rPr>
             <w:rStyle w:val="ae"/>
@@ -4470,7 +4470,7 @@
             <w:noProof/>
             <w:webHidden/>
           </w:rPr>
-          <w:instrText>PAGEREF _Toc235105769 \h</w:instrText>
+          <w:instrText>PAGEREF _Toc235197813 \h</w:instrText>
         </w:r>
         <w:r>
           <w:rPr>
@@ -4525,7 +4525,7 @@
           <w:sz w:val="22"/>
         </w:rPr>
       </w:pPr>
-      <w:hyperlink w:anchor="_Toc235105770" w:history="1">
+      <w:hyperlink w:anchor="_Toc235197814" w:history="1">
         <w:r>
           <w:rPr>
             <w:rStyle w:val="ae"/>
@@ -4569,7 +4569,7 @@
             <w:noProof/>
             <w:webHidden/>
           </w:rPr>
-          <w:instrText>PAGEREF _Toc235105770 \h</w:instrText>
+          <w:instrText>PAGEREF _Toc235197814 \h</w:instrText>
         </w:r>
         <w:r>
           <w:rPr>
@@ -4623,7 +4623,7 @@
           <w:sz w:val="22"/>
         </w:rPr>
       </w:pPr>
-      <w:hyperlink w:anchor="_Toc235105771" w:history="1">
+      <w:hyperlink w:anchor="_Toc235197815" w:history="1">
         <w:r>
           <w:rPr>
             <w:rStyle w:val="ae"/>
@@ -4674,7 +4674,7 @@
             <w:noProof/>
             <w:webHidden/>
           </w:rPr>
-          <w:instrText>PAGEREF _Toc235105771 \h</w:instrText>
+          <w:instrText>PAGEREF _Toc235197815 \h</w:instrText>
         </w:r>
         <w:r>
           <w:rPr>
@@ -4729,7 +4729,7 @@
           <w:sz w:val="22"/>
         </w:rPr>
       </w:pPr>
-      <w:hyperlink w:anchor="_Toc235105772" w:history="1">
+      <w:hyperlink w:anchor="_Toc235197816" w:history="1">
         <w:r>
           <w:rPr>
             <w:rStyle w:val="ae"/>
@@ -4773,7 +4773,7 @@
             <w:noProof/>
             <w:webHidden/>
           </w:rPr>
-          <w:instrText>PAGEREF _Toc235105772 \h</w:instrText>
+          <w:instrText>PAGEREF _Toc235197816 \h</w:instrText>
         </w:r>
         <w:r>
           <w:rPr>
@@ -4828,7 +4828,7 @@
           <w:sz w:val="22"/>
         </w:rPr>
       </w:pPr>
-      <w:hyperlink w:anchor="_Toc235105773" w:history="1">
+      <w:hyperlink w:anchor="_Toc235197817" w:history="1">
         <w:r>
           <w:rPr>
             <w:rStyle w:val="ae"/>
@@ -4872,7 +4872,7 @@
             <w:noProof/>
             <w:webHidden/>
           </w:rPr>
-          <w:instrText>PAGEREF _Toc235105773 \h</w:instrText>
+          <w:instrText>PAGEREF _Toc235197817 \h</w:instrText>
         </w:r>
         <w:r>
           <w:rPr>
@@ -4927,7 +4927,7 @@
           <w:sz w:val="22"/>
         </w:rPr>
       </w:pPr>
-      <w:hyperlink w:anchor="_Toc235105774" w:history="1">
+      <w:hyperlink w:anchor="_Toc235197818" w:history="1">
         <w:r>
           <w:rPr>
             <w:rStyle w:val="ae"/>
@@ -4985,7 +4985,7 @@
             <w:noProof/>
             <w:webHidden/>
           </w:rPr>
-          <w:instrText>PAGEREF _Toc235105774 \h</w:instrText>
+          <w:instrText>PAGEREF _Toc235197818 \h</w:instrText>
         </w:r>
         <w:r>
           <w:rPr>
@@ -5040,7 +5040,7 @@
           <w:sz w:val="22"/>
         </w:rPr>
       </w:pPr>
-      <w:hyperlink w:anchor="_Toc235105775" w:history="1">
+      <w:hyperlink w:anchor="_Toc235197819" w:history="1">
         <w:r>
           <w:rPr>
             <w:rStyle w:val="ae"/>
@@ -5084,7 +5084,7 @@
             <w:noProof/>
             <w:webHidden/>
           </w:rPr>
-          <w:instrText>PAGEREF _Toc235105775 \h</w:instrText>
+          <w:instrText>PAGEREF _Toc235197819 \h</w:instrText>
         </w:r>
         <w:r>
           <w:rPr>
@@ -5139,7 +5139,7 @@
           <w:sz w:val="22"/>
         </w:rPr>
       </w:pPr>
-      <w:hyperlink w:anchor="_Toc235105776" w:history="1">
+      <w:hyperlink w:anchor="_Toc235197820" w:history="1">
         <w:r>
           <w:rPr>
             <w:rStyle w:val="ae"/>
@@ -5183,7 +5183,7 @@
             <w:noProof/>
             <w:webHidden/>
           </w:rPr>
-          <w:instrText>PAGEREF _Toc235105776 \h</w:instrText>
+          <w:instrText>PAGEREF _Toc235197820 \h</w:instrText>
         </w:r>
         <w:r>
           <w:rPr>
@@ -5238,7 +5238,7 @@
           <w:sz w:val="22"/>
         </w:rPr>
       </w:pPr>
-      <w:hyperlink w:anchor="_Toc235105777" w:history="1">
+      <w:hyperlink w:anchor="_Toc235197821" w:history="1">
         <w:r>
           <w:rPr>
             <w:rStyle w:val="ae"/>
@@ -5282,7 +5282,7 @@
             <w:noProof/>
             <w:webHidden/>
           </w:rPr>
-          <w:instrText>PAGEREF _Toc235105777 \h</w:instrText>
+          <w:instrText>PAGEREF _Toc235197821 \h</w:instrText>
         </w:r>
         <w:r>
           <w:rPr>
@@ -5337,7 +5337,7 @@
           <w:sz w:val="22"/>
         </w:rPr>
       </w:pPr>
-      <w:hyperlink w:anchor="_Toc235105778" w:history="1">
+      <w:hyperlink w:anchor="_Toc235197822" w:history="1">
         <w:r>
           <w:rPr>
             <w:rStyle w:val="ae"/>
@@ -5381,7 +5381,7 @@
             <w:noProof/>
             <w:webHidden/>
           </w:rPr>
-          <w:instrText>PAGEREF _Toc235105778 \h</w:instrText>
+          <w:instrText>PAGEREF _Toc235197822 \h</w:instrText>
         </w:r>
         <w:r>
           <w:rPr>
@@ -5436,7 +5436,7 @@
           <w:sz w:val="22"/>
         </w:rPr>
       </w:pPr>
-      <w:hyperlink w:anchor="_Toc235105779" w:history="1">
+      <w:hyperlink w:anchor="_Toc235197823" w:history="1">
         <w:r>
           <w:rPr>
             <w:rStyle w:val="ae"/>
@@ -5487,7 +5487,7 @@
             <w:noProof/>
             <w:webHidden/>
           </w:rPr>
-          <w:instrText>PAGEREF _Toc235105779 \h</w:instrText>
+          <w:instrText>PAGEREF _Toc235197823 \h</w:instrText>
         </w:r>
         <w:r>
           <w:rPr>
@@ -5542,7 +5542,7 @@
           <w:sz w:val="22"/>
         </w:rPr>
       </w:pPr>
-      <w:hyperlink w:anchor="_Toc235105780" w:history="1">
+      <w:hyperlink w:anchor="_Toc235197824" w:history="1">
         <w:r>
           <w:rPr>
             <w:rStyle w:val="ae"/>
@@ -5586,7 +5586,7 @@
             <w:noProof/>
             <w:webHidden/>
           </w:rPr>
-          <w:instrText>PAGEREF _Toc235105780 \h</w:instrText>
+          <w:instrText>PAGEREF _Toc235197824 \h</w:instrText>
         </w:r>
         <w:r>
           <w:rPr>
@@ -5641,7 +5641,7 @@
           <w:sz w:val="22"/>
         </w:rPr>
       </w:pPr>
-      <w:hyperlink w:anchor="_Toc235105781" w:history="1">
+      <w:hyperlink w:anchor="_Toc235197825" w:history="1">
         <w:r>
           <w:rPr>
             <w:rStyle w:val="ae"/>
@@ -5685,7 +5685,7 @@
             <w:noProof/>
             <w:webHidden/>
           </w:rPr>
-          <w:instrText>PAGEREF _Toc235105781 \h</w:instrText>
+          <w:instrText>PAGEREF _Toc235197825 \h</w:instrText>
         </w:r>
         <w:r>
           <w:rPr>
@@ -5739,7 +5739,7 @@
           <w:sz w:val="22"/>
         </w:rPr>
       </w:pPr>
-      <w:hyperlink w:anchor="_Toc235105782" w:history="1">
+      <w:hyperlink w:anchor="_Toc235197826" w:history="1">
         <w:r>
           <w:rPr>
             <w:rStyle w:val="ae"/>
@@ -5776,7 +5776,7 @@
             <w:noProof/>
             <w:webHidden/>
           </w:rPr>
-          <w:instrText>PAGEREF _Toc235105782 \h</w:instrText>
+          <w:instrText>PAGEREF _Toc235197826 \h</w:instrText>
         </w:r>
         <w:r>
           <w:rPr>
@@ -5830,7 +5830,7 @@
           <w:sz w:val="22"/>
         </w:rPr>
       </w:pPr>
-      <w:hyperlink w:anchor="_Toc235105783" w:history="1">
+      <w:hyperlink w:anchor="_Toc235197827" w:history="1">
         <w:r>
           <w:rPr>
             <w:rStyle w:val="ae"/>
@@ -5881,7 +5881,7 @@
             <w:noProof/>
             <w:webHidden/>
           </w:rPr>
-          <w:instrText>PAGEREF _Toc235105783 \h</w:instrText>
+          <w:instrText>PAGEREF _Toc235197827 \h</w:instrText>
         </w:r>
         <w:r>
           <w:rPr>
@@ -5935,7 +5935,7 @@
           <w:sz w:val="22"/>
         </w:rPr>
       </w:pPr>
-      <w:hyperlink w:anchor="_Toc235105784" w:history="1">
+      <w:hyperlink w:anchor="_Toc235197828" w:history="1">
         <w:r>
           <w:rPr>
             <w:rStyle w:val="ae"/>
@@ -5986,7 +5986,7 @@
             <w:noProof/>
             <w:webHidden/>
           </w:rPr>
-          <w:instrText>PAGEREF _Toc235105784 \h</w:instrText>
+          <w:instrText>PAGEREF _Toc235197828 \h</w:instrText>
         </w:r>
         <w:r>
           <w:rPr>
@@ -6040,7 +6040,7 @@
           <w:sz w:val="22"/>
         </w:rPr>
       </w:pPr>
-      <w:hyperlink w:anchor="_Toc235105785" w:history="1">
+      <w:hyperlink w:anchor="_Toc235197829" w:history="1">
         <w:r>
           <w:rPr>
             <w:rStyle w:val="ae"/>
@@ -6091,7 +6091,7 @@
             <w:noProof/>
             <w:webHidden/>
           </w:rPr>
-          <w:instrText>PAGEREF _Toc235105785 \h</w:instrText>
+          <w:instrText>PAGEREF _Toc235197829 \h</w:instrText>
         </w:r>
         <w:r>
           <w:rPr>
@@ -6160,7 +6160,7 @@
           <w:rFonts w:hint="eastAsia"/>
         </w:rPr>
       </w:pPr>
-      <w:bookmarkStart w:id="0" w:name="_Toc235105728"/>
+      <w:bookmarkStart w:id="0" w:name="_Toc235197772"/>
       <w:r>
         <w:rPr>
           <w:rFonts w:hint="eastAsia"/>
@@ -6911,7 +6911,7 @@
           <w:rFonts w:hint="eastAsia"/>
         </w:rPr>
       </w:pPr>
-      <w:bookmarkStart w:id="1" w:name="_Toc235105729"/>
+      <w:bookmarkStart w:id="1" w:name="_Toc235197773"/>
       <w:r>
         <w:rPr>
           <w:rFonts w:hint="eastAsia"/>
@@ -6942,7 +6942,7 @@
           <w:rFonts w:hint="eastAsia"/>
         </w:rPr>
       </w:pPr>
-      <w:bookmarkStart w:id="2" w:name="_Toc235105730"/>
+      <w:bookmarkStart w:id="2" w:name="_Toc235197774"/>
       <w:r>
         <w:rPr>
           <w:rFonts w:hint="eastAsia"/>
@@ -7556,7 +7556,7 @@
           <w:rFonts w:hint="eastAsia"/>
         </w:rPr>
       </w:pPr>
-      <w:bookmarkStart w:id="3" w:name="_Toc235105731"/>
+      <w:bookmarkStart w:id="3" w:name="_Toc235197775"/>
       <w:r>
         <w:rPr>
           <w:rFonts w:hint="eastAsia"/>
@@ -7998,7 +7998,7 @@
           <w:rFonts w:hint="eastAsia"/>
         </w:rPr>
       </w:pPr>
-      <w:bookmarkStart w:id="4" w:name="_Toc235105732"/>
+      <w:bookmarkStart w:id="4" w:name="_Toc235197776"/>
       <w:r>
         <w:rPr>
           <w:rFonts w:hint="eastAsia"/>
@@ -9013,7 +9013,7 @@
           <w:rFonts w:hint="eastAsia"/>
         </w:rPr>
       </w:pPr>
-      <w:bookmarkStart w:id="5" w:name="_Toc235105733"/>
+      <w:bookmarkStart w:id="5" w:name="_Toc235197777"/>
       <w:r>
         <w:rPr>
           <w:rFonts w:hint="eastAsia"/>
@@ -9044,7 +9044,7 @@
           <w:rFonts w:hint="eastAsia"/>
         </w:rPr>
       </w:pPr>
-      <w:bookmarkStart w:id="6" w:name="_Toc235105734"/>
+      <w:bookmarkStart w:id="6" w:name="_Toc235197778"/>
       <w:r>
         <w:rPr>
           <w:rFonts w:hint="eastAsia"/>
@@ -10521,7 +10521,7 @@
           <w:rFonts w:hint="eastAsia"/>
         </w:rPr>
       </w:pPr>
-      <w:bookmarkStart w:id="7" w:name="_Toc235105735"/>
+      <w:bookmarkStart w:id="7" w:name="_Toc235197779"/>
       <w:r>
         <w:rPr>
           <w:rFonts w:hint="eastAsia"/>
@@ -11483,7 +11483,7 @@
           <w:rFonts w:hint="eastAsia"/>
         </w:rPr>
       </w:pPr>
-      <w:bookmarkStart w:id="8" w:name="_Toc235105736"/>
+      <w:bookmarkStart w:id="8" w:name="_Toc235197780"/>
       <w:r>
         <w:rPr>
           <w:rFonts w:hint="eastAsia"/>
@@ -12403,13 +12403,13 @@
         <w:rPr>
           <w:rFonts w:hint="eastAsia"/>
         </w:rPr>
-        <w:t>，来自</w:t>
-      </w:r>
-      <w:r>
-        <w:rPr>
-          <w:rFonts w:hint="eastAsia"/>
-        </w:rPr>
-        <w:t xml:space="preserve"> 500 </w:t>
+        <w:t>；</w:t>
+      </w:r>
+      <w:r>
+        <w:rPr>
+          <w:rFonts w:hint="eastAsia"/>
+        </w:rPr>
+        <w:t xml:space="preserve">500 </w:t>
       </w:r>
       <w:r>
         <w:rPr>
@@ -12439,7 +12439,27 @@
         <w:rPr>
           <w:rFonts w:hint="eastAsia"/>
         </w:rPr>
-        <w:t>个决策样本。</w:t>
+        <w:t>个决策样本的原始数据集元信息见</w:t>
+      </w:r>
+      <w:r>
+        <w:rPr>
+          <w:rFonts w:hint="eastAsia"/>
+        </w:rPr>
+        <w:t xml:space="preserve"> </w:t>
+      </w:r>
+      <w:r>
+        <w:rPr>
+          <w:rFonts w:eastAsia="等线" w:hint="eastAsia"/>
+          <w:sz w:val="19"/>
+          <w:shd w:val="clear" w:color="auto" w:fill="F2F2F2"/>
+        </w:rPr>
+        <w:t>artifacts/diagnostic_logs/bc_dataset_sanity_check_output.log</w:t>
+      </w:r>
+      <w:r>
+        <w:rPr>
+          <w:rFonts w:hint="eastAsia"/>
+        </w:rPr>
+        <w:t>。</w:t>
       </w:r>
     </w:p>
     <w:p>
@@ -12451,7 +12471,7 @@
           <w:rFonts w:hint="eastAsia"/>
         </w:rPr>
       </w:pPr>
-      <w:bookmarkStart w:id="9" w:name="_Toc235105737"/>
+      <w:bookmarkStart w:id="9" w:name="_Toc235197781"/>
       <w:r>
         <w:rPr>
           <w:rFonts w:hint="eastAsia"/>
@@ -12475,7 +12495,7 @@
           <w:rFonts w:hint="eastAsia"/>
         </w:rPr>
       </w:pPr>
-      <w:bookmarkStart w:id="10" w:name="_Toc235105738"/>
+      <w:bookmarkStart w:id="10" w:name="_Toc235197782"/>
       <w:r>
         <w:rPr>
           <w:rFonts w:hint="eastAsia"/>
@@ -12577,7 +12597,14 @@
         <w:rPr>
           <w:rFonts w:hint="eastAsia"/>
         </w:rPr>
-        <w:t>，一次同时选择任务和资源。该模式保留用于历史对照。</w:t>
+        <w:t>，一次同时选择任务和资源。该模式保留</w:t>
+      </w:r>
+      <w:r>
+        <w:rPr>
+          <w:rFonts w:hint="eastAsia"/>
+        </w:rPr>
+        <w:lastRenderedPageBreak/>
+        <w:t>用于历史对照。</w:t>
       </w:r>
     </w:p>
     <w:p>
@@ -12589,12 +12616,11 @@
           <w:rFonts w:hint="eastAsia"/>
         </w:rPr>
       </w:pPr>
-      <w:bookmarkStart w:id="11" w:name="_Toc235105739"/>
-      <w:r>
-        <w:rPr>
-          <w:rFonts w:hint="eastAsia"/>
-        </w:rPr>
-        <w:lastRenderedPageBreak/>
+      <w:bookmarkStart w:id="11" w:name="_Toc235197783"/>
+      <w:r>
+        <w:rPr>
+          <w:rFonts w:hint="eastAsia"/>
+        </w:rPr>
         <w:t xml:space="preserve">2.4.2 Ranked </w:t>
       </w:r>
       <w:r>
@@ -12719,7 +12745,7 @@
           <w:rFonts w:hint="eastAsia"/>
         </w:rPr>
       </w:pPr>
-      <w:bookmarkStart w:id="12" w:name="_Toc235105740"/>
+      <w:bookmarkStart w:id="12" w:name="_Toc235197784"/>
       <w:r>
         <w:rPr>
           <w:rFonts w:hint="eastAsia"/>
@@ -12840,7 +12866,7 @@
           <w:rFonts w:hint="eastAsia"/>
         </w:rPr>
       </w:pPr>
-      <w:bookmarkStart w:id="13" w:name="_Toc235105741"/>
+      <w:bookmarkStart w:id="13" w:name="_Toc235197785"/>
       <w:r>
         <w:rPr>
           <w:rFonts w:hint="eastAsia"/>
@@ -13118,7 +13144,7 @@
           <w:rFonts w:hint="eastAsia"/>
         </w:rPr>
       </w:pPr>
-      <w:bookmarkStart w:id="14" w:name="_Toc235105742"/>
+      <w:bookmarkStart w:id="14" w:name="_Toc235197786"/>
       <w:r>
         <w:rPr>
           <w:rFonts w:hint="eastAsia"/>
@@ -13904,7 +13930,7 @@
           <w:rFonts w:hint="eastAsia"/>
         </w:rPr>
       </w:pPr>
-      <w:bookmarkStart w:id="15" w:name="_Toc235105743"/>
+      <w:bookmarkStart w:id="15" w:name="_Toc235197787"/>
       <w:r>
         <w:rPr>
           <w:rFonts w:hint="eastAsia"/>
@@ -14376,7 +14402,7 @@
           <w:rFonts w:hint="eastAsia"/>
         </w:rPr>
       </w:pPr>
-      <w:bookmarkStart w:id="16" w:name="_Toc235105744"/>
+      <w:bookmarkStart w:id="16" w:name="_Toc235197788"/>
       <w:r>
         <w:rPr>
           <w:rFonts w:hint="eastAsia"/>
@@ -14407,7 +14433,7 @@
           <w:rFonts w:hint="eastAsia"/>
         </w:rPr>
       </w:pPr>
-      <w:bookmarkStart w:id="17" w:name="_Toc235105745"/>
+      <w:bookmarkStart w:id="17" w:name="_Toc235197789"/>
       <w:r>
         <w:rPr>
           <w:rFonts w:hint="eastAsia"/>
@@ -14639,7 +14665,7 @@
           <w:sz w:val="19"/>
           <w:shd w:val="clear" w:color="auto" w:fill="F2F2F2"/>
         </w:rPr>
-        <w:t>diagnostics_action_distribution_output.log</w:t>
+        <w:t>artifacts/diagnostic_logs/diagnostics_action_distribution_output.log</w:t>
       </w:r>
       <w:r>
         <w:rPr>
@@ -14808,7 +14834,7 @@
           <w:rFonts w:hint="eastAsia"/>
         </w:rPr>
       </w:pPr>
-      <w:bookmarkStart w:id="18" w:name="_Toc235105746"/>
+      <w:bookmarkStart w:id="18" w:name="_Toc235197790"/>
       <w:r>
         <w:rPr>
           <w:rFonts w:hint="eastAsia"/>
@@ -15193,7 +15219,7 @@
           <w:sz w:val="19"/>
           <w:shd w:val="clear" w:color="auto" w:fill="F2F2F2"/>
         </w:rPr>
-        <w:t>reward_shaped_action_distribution_output.log</w:t>
+        <w:t>artifacts/diagnostic_logs/reward_shaped_action_distribution_output.log</w:t>
       </w:r>
       <w:r>
         <w:rPr>
@@ -15261,7 +15287,7 @@
           <w:rFonts w:hint="eastAsia"/>
         </w:rPr>
       </w:pPr>
-      <w:bookmarkStart w:id="19" w:name="_Toc235105747"/>
+      <w:bookmarkStart w:id="19" w:name="_Toc235197791"/>
       <w:r>
         <w:rPr>
           <w:rFonts w:hint="eastAsia"/>
@@ -15931,7 +15957,7 @@
           <w:rFonts w:hint="eastAsia"/>
         </w:rPr>
       </w:pPr>
-      <w:bookmarkStart w:id="20" w:name="_Toc235105748"/>
+      <w:bookmarkStart w:id="20" w:name="_Toc235197792"/>
       <w:r>
         <w:rPr>
           <w:rFonts w:hint="eastAsia"/>
@@ -15958,7 +15984,7 @@
           <w:sz w:val="19"/>
           <w:shd w:val="clear" w:color="auto" w:fill="F2F2F2"/>
         </w:rPr>
-        <w:t>bc_batch_mask_and_normalization_check_output.log</w:t>
+        <w:t>artifacts/diagnostic_logs/bc_batch_mask_and_normalization_check_output.log</w:t>
       </w:r>
       <w:r>
         <w:rPr>
@@ -16254,7 +16280,7 @@
           <w:sz w:val="19"/>
           <w:shd w:val="clear" w:color="auto" w:fill="F2F2F2"/>
         </w:rPr>
-        <w:t>mlp_bc_normalized_strength_test_80e_lr1e3_output.log</w:t>
+        <w:t>artifacts/diagnostic_logs/mlp_bc_normalized_strength_test_80e_lr1e3_output.log</w:t>
       </w:r>
       <w:r>
         <w:rPr>
@@ -16477,7 +16503,7 @@
           <w:sz w:val="19"/>
           <w:shd w:val="clear" w:color="auto" w:fill="F2F2F2"/>
         </w:rPr>
-        <w:t>mlp_normalized_action_distribution_output.log</w:t>
+        <w:t>artifacts/diagnostic_logs/mlp_normalized_action_distribution_output.log</w:t>
       </w:r>
       <w:r>
         <w:rPr>
@@ -16495,7 +16521,7 @@
           <w:rFonts w:hint="eastAsia"/>
         </w:rPr>
       </w:pPr>
-      <w:bookmarkStart w:id="21" w:name="_Toc235105749"/>
+      <w:bookmarkStart w:id="21" w:name="_Toc235197793"/>
       <w:r>
         <w:rPr>
           <w:rFonts w:hint="eastAsia"/>
@@ -16711,7 +16737,7 @@
           <w:sz w:val="19"/>
           <w:shd w:val="clear" w:color="auto" w:fill="F2F2F2"/>
         </w:rPr>
-        <w:t>action_space_complexity_check_output.log</w:t>
+        <w:t>artifacts/diagnostic_logs/action_space_complexity_check_output.log</w:t>
       </w:r>
       <w:r>
         <w:rPr>
@@ -17107,7 +17133,7 @@
           <w:rFonts w:hint="eastAsia"/>
         </w:rPr>
       </w:pPr>
-      <w:bookmarkStart w:id="22" w:name="_Toc235105750"/>
+      <w:bookmarkStart w:id="22" w:name="_Toc235197794"/>
       <w:r>
         <w:rPr>
           <w:rFonts w:hint="eastAsia"/>
@@ -17200,7 +17226,7 @@
           <w:rFonts w:hint="eastAsia"/>
         </w:rPr>
       </w:pPr>
-      <w:bookmarkStart w:id="23" w:name="_Toc235105751"/>
+      <w:bookmarkStart w:id="23" w:name="_Toc235197795"/>
       <w:r>
         <w:rPr>
           <w:rFonts w:hint="eastAsia"/>
@@ -17414,7 +17440,7 @@
           <w:sz w:val="19"/>
           <w:shd w:val="clear" w:color="auto" w:fill="F2F2F2"/>
         </w:rPr>
-        <w:t>bc_dataset_sanity_check_output.log</w:t>
+        <w:t>artifacts/diagnostic_logs/bc_dataset_sanity_check_output.log</w:t>
       </w:r>
       <w:r>
         <w:rPr>
@@ -17428,7 +17454,7 @@
           <w:sz w:val="19"/>
           <w:shd w:val="clear" w:color="auto" w:fill="F2F2F2"/>
         </w:rPr>
-        <w:t>bc_batch_mask_and_normalization_check_output.log</w:t>
+        <w:t>artifacts/diagnostic_logs/bc_batch_mask_and_normalization_check_output.log</w:t>
       </w:r>
       <w:r>
         <w:rPr>
@@ -17442,7 +17468,7 @@
           <w:sz w:val="19"/>
           <w:shd w:val="clear" w:color="auto" w:fill="F2F2F2"/>
         </w:rPr>
-        <w:t>scan_step1_ranked_bc_small_overfit.log</w:t>
+        <w:t>artifacts/diagnostic_logs/scan_step1_ranked_bc_small_overfit.log</w:t>
       </w:r>
       <w:r>
         <w:rPr>
@@ -17468,7 +17494,7 @@
           <w:sz w:val="19"/>
           <w:shd w:val="clear" w:color="auto" w:fill="F2F2F2"/>
         </w:rPr>
-        <w:t>scan_step1_ranked_bc_full_pretrain_only.log</w:t>
+        <w:t>artifacts/diagnostic_logs/scan_step1_ranked_bc_full_pretrain_only.log</w:t>
       </w:r>
       <w:r>
         <w:rPr>
@@ -17591,7 +17617,7 @@
           <w:rFonts w:hint="eastAsia"/>
         </w:rPr>
       </w:pPr>
-      <w:bookmarkStart w:id="24" w:name="_Toc235105752"/>
+      <w:bookmarkStart w:id="24" w:name="_Toc235197796"/>
       <w:r>
         <w:rPr>
           <w:rFonts w:hint="eastAsia"/>
@@ -19253,7 +19279,7 @@
           <w:rFonts w:hint="eastAsia"/>
         </w:rPr>
       </w:pPr>
-      <w:bookmarkStart w:id="25" w:name="_Toc235105753"/>
+      <w:bookmarkStart w:id="25" w:name="_Toc235197797"/>
       <w:r>
         <w:rPr>
           <w:rFonts w:hint="eastAsia"/>
@@ -19995,7 +20021,7 @@
           <w:rFonts w:hint="eastAsia"/>
         </w:rPr>
       </w:pPr>
-      <w:bookmarkStart w:id="26" w:name="_Toc235105754"/>
+      <w:bookmarkStart w:id="26" w:name="_Toc235197798"/>
       <w:r>
         <w:rPr>
           <w:rFonts w:hint="eastAsia"/>
@@ -20953,7 +20979,7 @@
           <w:rFonts w:hint="eastAsia"/>
         </w:rPr>
       </w:pPr>
-      <w:bookmarkStart w:id="27" w:name="_Toc235105755"/>
+      <w:bookmarkStart w:id="27" w:name="_Toc235197799"/>
       <w:r>
         <w:rPr>
           <w:rFonts w:hint="eastAsia"/>
@@ -21432,7 +21458,7 @@
           <w:rFonts w:hint="eastAsia"/>
         </w:rPr>
       </w:pPr>
-      <w:bookmarkStart w:id="28" w:name="_Toc235105756"/>
+      <w:bookmarkStart w:id="28" w:name="_Toc235197800"/>
       <w:r>
         <w:rPr>
           <w:rFonts w:hint="eastAsia"/>
@@ -21463,7 +21489,7 @@
           <w:rFonts w:hint="eastAsia"/>
         </w:rPr>
       </w:pPr>
-      <w:bookmarkStart w:id="29" w:name="_Toc235105757"/>
+      <w:bookmarkStart w:id="29" w:name="_Toc235197801"/>
       <w:r>
         <w:rPr>
           <w:rFonts w:hint="eastAsia"/>
@@ -23148,7 +23174,7 @@
           <w:rFonts w:hint="eastAsia"/>
         </w:rPr>
       </w:pPr>
-      <w:bookmarkStart w:id="30" w:name="_Toc235105758"/>
+      <w:bookmarkStart w:id="30" w:name="_Toc235197802"/>
       <w:r>
         <w:rPr>
           <w:rFonts w:hint="eastAsia"/>
@@ -23992,7 +24018,7 @@
           <w:rFonts w:hint="eastAsia"/>
         </w:rPr>
       </w:pPr>
-      <w:bookmarkStart w:id="31" w:name="_Toc235105759"/>
+      <w:bookmarkStart w:id="31" w:name="_Toc235197803"/>
       <w:r>
         <w:rPr>
           <w:rFonts w:hint="eastAsia"/>
@@ -24681,7 +24707,7 @@
           <w:rFonts w:hint="eastAsia"/>
         </w:rPr>
       </w:pPr>
-      <w:bookmarkStart w:id="32" w:name="_Toc235105760"/>
+      <w:bookmarkStart w:id="32" w:name="_Toc235197804"/>
       <w:r>
         <w:rPr>
           <w:rFonts w:hint="eastAsia"/>
@@ -25373,7 +25399,7 @@
           <w:rFonts w:hint="eastAsia"/>
         </w:rPr>
       </w:pPr>
-      <w:bookmarkStart w:id="33" w:name="_Toc235105761"/>
+      <w:bookmarkStart w:id="33" w:name="_Toc235197805"/>
       <w:r>
         <w:rPr>
           <w:rFonts w:hint="eastAsia"/>
@@ -25791,7 +25817,7 @@
           <w:rFonts w:hint="eastAsia"/>
         </w:rPr>
       </w:pPr>
-      <w:bookmarkStart w:id="34" w:name="_Toc235105762"/>
+      <w:bookmarkStart w:id="34" w:name="_Toc235197806"/>
       <w:r>
         <w:rPr>
           <w:rFonts w:hint="eastAsia"/>
@@ -26621,7 +26647,7 @@
           <w:rFonts w:hint="eastAsia"/>
         </w:rPr>
       </w:pPr>
-      <w:bookmarkStart w:id="35" w:name="_Toc235105763"/>
+      <w:bookmarkStart w:id="35" w:name="_Toc235197807"/>
       <w:r>
         <w:rPr>
           <w:rFonts w:hint="eastAsia"/>
@@ -27054,7 +27080,7 @@
           <w:rFonts w:hint="eastAsia"/>
         </w:rPr>
       </w:pPr>
-      <w:bookmarkStart w:id="36" w:name="_Toc235105764"/>
+      <w:bookmarkStart w:id="36" w:name="_Toc235197808"/>
       <w:r>
         <w:rPr>
           <w:rFonts w:hint="eastAsia"/>
@@ -27139,31 +27165,7 @@
         <w:rPr>
           <w:rFonts w:hint="eastAsia"/>
         </w:rPr>
-        <w:t>步，</w:t>
-      </w:r>
-      <w:r>
-        <w:rPr>
-          <w:rFonts w:hint="eastAsia"/>
-        </w:rPr>
-        <w:t xml:space="preserve">Monitor </w:t>
-      </w:r>
-      <w:r>
-        <w:rPr>
-          <w:rFonts w:hint="eastAsia"/>
-        </w:rPr>
-        <w:t>累计环境步数为</w:t>
-      </w:r>
-      <w:r>
-        <w:rPr>
-          <w:rFonts w:hint="eastAsia"/>
-        </w:rPr>
-        <w:t xml:space="preserve"> 200691</w:t>
-      </w:r>
-      <w:r>
-        <w:rPr>
-          <w:rFonts w:hint="eastAsia"/>
-        </w:rPr>
-        <w:t>，训练耗时</w:t>
+        <w:t>步，训练耗时</w:t>
       </w:r>
       <w:r>
         <w:rPr>
@@ -27222,7 +27224,31 @@
         <w:rPr>
           <w:rFonts w:hint="eastAsia"/>
         </w:rPr>
-        <w:t>。</w:t>
+        <w:t>。开发过程曾另行统计</w:t>
+      </w:r>
+      <w:r>
+        <w:rPr>
+          <w:rFonts w:hint="eastAsia"/>
+        </w:rPr>
+        <w:t xml:space="preserve"> Monitor </w:t>
+      </w:r>
+      <w:r>
+        <w:rPr>
+          <w:rFonts w:hint="eastAsia"/>
+        </w:rPr>
+        <w:t>累计环境步数，但对应原始</w:t>
+      </w:r>
+      <w:r>
+        <w:rPr>
+          <w:rFonts w:hint="eastAsia"/>
+        </w:rPr>
+        <w:t xml:space="preserve"> Monitor </w:t>
+      </w:r>
+      <w:r>
+        <w:rPr>
+          <w:rFonts w:hint="eastAsia"/>
+        </w:rPr>
+        <w:t>文件未纳入最终证据归档，因此本报告不再引用该数字。</w:t>
       </w:r>
     </w:p>
     <w:p>
@@ -27407,7 +27433,7 @@
           <w:sz w:val="19"/>
           <w:shd w:val="clear" w:color="auto" w:fill="F2F2F2"/>
         </w:rPr>
-        <w:t>gat_full_train_20260707_133559_output.log</w:t>
+        <w:t>artifacts/training_logs/gat_full_train_20260707_133559_output.log</w:t>
       </w:r>
       <w:r>
         <w:rPr>
@@ -27433,7 +27459,7 @@
           <w:sz w:val="19"/>
           <w:shd w:val="clear" w:color="auto" w:fill="F2F2F2"/>
         </w:rPr>
-        <w:t>mlp_ranked_train_output.log</w:t>
+        <w:t>artifacts/training_logs/mlp_ranked_train_output.log</w:t>
       </w:r>
       <w:r>
         <w:rPr>
@@ -27476,7 +27502,7 @@
           <w:rFonts w:hint="eastAsia"/>
         </w:rPr>
       </w:pPr>
-      <w:bookmarkStart w:id="37" w:name="_Toc235105765"/>
+      <w:bookmarkStart w:id="37" w:name="_Toc235197809"/>
       <w:r>
         <w:rPr>
           <w:rFonts w:hint="eastAsia"/>
@@ -27507,7 +27533,7 @@
           <w:rFonts w:hint="eastAsia"/>
         </w:rPr>
       </w:pPr>
-      <w:bookmarkStart w:id="38" w:name="_Toc235105766"/>
+      <w:bookmarkStart w:id="38" w:name="_Toc235197810"/>
       <w:r>
         <w:rPr>
           <w:rFonts w:hint="eastAsia"/>
@@ -28644,7 +28670,7 @@
           <w:rFonts w:hint="eastAsia"/>
         </w:rPr>
       </w:pPr>
-      <w:bookmarkStart w:id="39" w:name="_Toc235105767"/>
+      <w:bookmarkStart w:id="39" w:name="_Toc235197811"/>
       <w:r>
         <w:rPr>
           <w:rFonts w:hint="eastAsia"/>
@@ -29211,7 +29237,7 @@
           <w:rFonts w:hint="eastAsia"/>
         </w:rPr>
       </w:pPr>
-      <w:bookmarkStart w:id="40" w:name="_Toc235105768"/>
+      <w:bookmarkStart w:id="40" w:name="_Toc235197812"/>
       <w:r>
         <w:rPr>
           <w:rFonts w:hint="eastAsia"/>
@@ -29710,7 +29736,7 @@
           <w:rFonts w:hint="eastAsia"/>
         </w:rPr>
       </w:pPr>
-      <w:bookmarkStart w:id="41" w:name="_Toc235105769"/>
+      <w:bookmarkStart w:id="41" w:name="_Toc235197813"/>
       <w:r>
         <w:rPr>
           <w:rFonts w:hint="eastAsia"/>
@@ -30649,7 +30675,7 @@
           <w:rFonts w:hint="eastAsia"/>
         </w:rPr>
       </w:pPr>
-      <w:bookmarkStart w:id="42" w:name="_Toc235105770"/>
+      <w:bookmarkStart w:id="42" w:name="_Toc235197814"/>
       <w:r>
         <w:rPr>
           <w:rFonts w:hint="eastAsia"/>
@@ -30841,7 +30867,7 @@
           <w:rFonts w:hint="eastAsia"/>
         </w:rPr>
       </w:pPr>
-      <w:bookmarkStart w:id="43" w:name="_Toc235105771"/>
+      <w:bookmarkStart w:id="43" w:name="_Toc235197815"/>
       <w:r>
         <w:rPr>
           <w:rFonts w:hint="eastAsia"/>
@@ -30872,7 +30898,7 @@
           <w:rFonts w:hint="eastAsia"/>
         </w:rPr>
       </w:pPr>
-      <w:bookmarkStart w:id="44" w:name="_Toc235105772"/>
+      <w:bookmarkStart w:id="44" w:name="_Toc235197816"/>
       <w:r>
         <w:rPr>
           <w:rFonts w:hint="eastAsia"/>
@@ -30896,7 +30922,7 @@
           <w:rFonts w:hint="eastAsia"/>
         </w:rPr>
       </w:pPr>
-      <w:bookmarkStart w:id="45" w:name="_Toc235105773"/>
+      <w:bookmarkStart w:id="45" w:name="_Toc235197817"/>
       <w:r>
         <w:rPr>
           <w:rFonts w:hint="eastAsia"/>
@@ -31037,7 +31063,7 @@
           <w:rFonts w:hint="eastAsia"/>
         </w:rPr>
       </w:pPr>
-      <w:bookmarkStart w:id="46" w:name="_Toc235105774"/>
+      <w:bookmarkStart w:id="46" w:name="_Toc235197818"/>
       <w:r>
         <w:rPr>
           <w:rFonts w:hint="eastAsia"/>
@@ -31134,7 +31160,7 @@
           <w:rFonts w:hint="eastAsia"/>
         </w:rPr>
       </w:pPr>
-      <w:bookmarkStart w:id="47" w:name="_Toc235105775"/>
+      <w:bookmarkStart w:id="47" w:name="_Toc235197819"/>
       <w:r>
         <w:rPr>
           <w:rFonts w:hint="eastAsia"/>
@@ -31237,7 +31263,7 @@
           <w:rFonts w:hint="eastAsia"/>
         </w:rPr>
       </w:pPr>
-      <w:bookmarkStart w:id="48" w:name="_Toc235105776"/>
+      <w:bookmarkStart w:id="48" w:name="_Toc235197820"/>
       <w:r>
         <w:rPr>
           <w:rFonts w:hint="eastAsia"/>
@@ -31328,7 +31354,7 @@
           <w:rFonts w:hint="eastAsia"/>
         </w:rPr>
       </w:pPr>
-      <w:bookmarkStart w:id="49" w:name="_Toc235105777"/>
+      <w:bookmarkStart w:id="49" w:name="_Toc235197821"/>
       <w:r>
         <w:rPr>
           <w:rFonts w:hint="eastAsia"/>
@@ -31352,7 +31378,7 @@
           <w:rFonts w:hint="eastAsia"/>
         </w:rPr>
       </w:pPr>
-      <w:bookmarkStart w:id="50" w:name="_Toc235105778"/>
+      <w:bookmarkStart w:id="50" w:name="_Toc235197822"/>
       <w:r>
         <w:rPr>
           <w:rFonts w:hint="eastAsia"/>
@@ -31480,7 +31506,7 @@
           <w:rFonts w:hint="eastAsia"/>
         </w:rPr>
       </w:pPr>
-      <w:bookmarkStart w:id="51" w:name="_Toc235105779"/>
+      <w:bookmarkStart w:id="51" w:name="_Toc235197823"/>
       <w:r>
         <w:rPr>
           <w:rFonts w:hint="eastAsia"/>
@@ -31595,7 +31621,7 @@
           <w:rFonts w:hint="eastAsia"/>
         </w:rPr>
       </w:pPr>
-      <w:bookmarkStart w:id="52" w:name="_Toc235105780"/>
+      <w:bookmarkStart w:id="52" w:name="_Toc235197824"/>
       <w:r>
         <w:rPr>
           <w:rFonts w:hint="eastAsia"/>
@@ -31734,7 +31760,7 @@
           <w:rFonts w:hint="eastAsia"/>
         </w:rPr>
       </w:pPr>
-      <w:bookmarkStart w:id="53" w:name="_Toc235105781"/>
+      <w:bookmarkStart w:id="53" w:name="_Toc235197825"/>
       <w:r>
         <w:rPr>
           <w:rFonts w:hint="eastAsia"/>
@@ -31844,7 +31870,7 @@
           <w:rFonts w:hint="eastAsia"/>
         </w:rPr>
       </w:pPr>
-      <w:bookmarkStart w:id="54" w:name="_Toc235105782"/>
+      <w:bookmarkStart w:id="54" w:name="_Toc235197826"/>
       <w:r>
         <w:rPr>
           <w:rFonts w:hint="eastAsia"/>
@@ -32134,7 +32160,7 @@
           <w:rFonts w:hint="eastAsia"/>
         </w:rPr>
       </w:pPr>
-      <w:bookmarkStart w:id="55" w:name="_Toc235105783"/>
+      <w:bookmarkStart w:id="55" w:name="_Toc235197827"/>
       <w:r>
         <w:rPr>
           <w:rFonts w:hint="eastAsia"/>
@@ -33002,7 +33028,7 @@
           <w:rFonts w:hint="eastAsia"/>
         </w:rPr>
       </w:pPr>
-      <w:bookmarkStart w:id="56" w:name="_Toc235105784"/>
+      <w:bookmarkStart w:id="56" w:name="_Toc235197828"/>
       <w:r>
         <w:rPr>
           <w:rFonts w:hint="eastAsia"/>
@@ -33323,9 +33349,6 @@
         <w:spacing w:after="60"/>
         <w:ind w:left="480" w:hanging="280"/>
         <w:jc w:val="left"/>
-        <w:rPr>
-          <w:rFonts w:hint="eastAsia"/>
-        </w:rPr>
       </w:pPr>
       <w:r>
         <w:rPr>
@@ -33412,7 +33435,7 @@
           <w:sz w:val="19"/>
           <w:shd w:val="clear" w:color="auto" w:fill="F2F2F2"/>
         </w:rPr>
-        <w:t>summary_reward_shaped.json</w:t>
+        <w:t>evaluation/results/summary_reward_shaped.json</w:t>
       </w:r>
       <w:r>
         <w:rPr>
@@ -33444,7 +33467,7 @@
           <w:sz w:val="19"/>
           <w:shd w:val="clear" w:color="auto" w:fill="F2F2F2"/>
         </w:rPr>
-        <w:t>reward_shaped_action_distribution_output.log</w:t>
+        <w:t>artifacts/diagnostic_logs/reward_shaped_action_distribution_output.log</w:t>
       </w:r>
       <w:r>
         <w:rPr>
@@ -33567,7 +33590,7 @@
           <w:sz w:val="19"/>
           <w:shd w:val="clear" w:color="auto" w:fill="F2F2F2"/>
         </w:rPr>
-        <w:t>mlp_normalized_action_distribution_output.log</w:t>
+        <w:t>artifacts/diagnostic_logs/mlp_normalized_action_distribution_output.log</w:t>
       </w:r>
       <w:r>
         <w:rPr>
@@ -33790,7 +33813,7 @@
           <w:sz w:val="19"/>
           <w:shd w:val="clear" w:color="auto" w:fill="F2F2F2"/>
         </w:rPr>
-        <w:t>residual_train_ppo_mlp_residual.log</w:t>
+        <w:t>artifacts/training_logs/residual_train_ppo_mlp_residual.log</w:t>
       </w:r>
       <w:r>
         <w:rPr>
@@ -33876,7 +33899,7 @@
           <w:rFonts w:hint="eastAsia"/>
         </w:rPr>
       </w:pPr>
-      <w:bookmarkStart w:id="57" w:name="_Toc235105785"/>
+      <w:bookmarkStart w:id="57" w:name="_Toc235197829"/>
       <w:r>
         <w:rPr>
           <w:rFonts w:hint="eastAsia"/>
@@ -34147,7 +34170,7 @@
           <w:sz w:val="19"/>
           <w:shd w:val="clear" w:color="auto" w:fill="F2F2F2"/>
         </w:rPr>
-        <w:t>action_space_complexity_check_output.log</w:t>
+        <w:t>artifacts/diagnostic_logs/action_space_complexity_check_output.log</w:t>
       </w:r>
     </w:p>
     <w:p>
@@ -34183,7 +34206,7 @@
           <w:sz w:val="19"/>
           <w:shd w:val="clear" w:color="auto" w:fill="F2F2F2"/>
         </w:rPr>
-        <w:t>bc_batch_mask_and_normalization_check_output.log</w:t>
+        <w:t>artifacts/diagnostic_logs/bc_batch_mask_and_normalization_check_output.log</w:t>
       </w:r>
     </w:p>
     <w:p>
@@ -34971,7 +34994,7 @@
     <w:link w:val="10"/>
     <w:uiPriority w:val="9"/>
     <w:qFormat/>
-    <w:rsid w:val="00C756EF"/>
+    <w:rsid w:val="00BA2A10"/>
     <w:pPr>
       <w:keepNext/>
       <w:keepLines/>
@@ -34995,7 +35018,7 @@
     <w:uiPriority w:val="9"/>
     <w:unhideWhenUsed/>
     <w:qFormat/>
-    <w:rsid w:val="00C756EF"/>
+    <w:rsid w:val="00BA2A10"/>
     <w:pPr>
       <w:keepNext/>
       <w:keepLines/>
@@ -35019,7 +35042,7 @@
     <w:uiPriority w:val="9"/>
     <w:unhideWhenUsed/>
     <w:qFormat/>
-    <w:rsid w:val="00C756EF"/>
+    <w:rsid w:val="00BA2A10"/>
     <w:pPr>
       <w:keepNext/>
       <w:keepLines/>
@@ -35043,7 +35066,7 @@
     <w:semiHidden/>
     <w:unhideWhenUsed/>
     <w:qFormat/>
-    <w:rsid w:val="00C756EF"/>
+    <w:rsid w:val="00BA2A10"/>
     <w:pPr>
       <w:keepNext/>
       <w:keepLines/>
@@ -35066,7 +35089,7 @@
     <w:semiHidden/>
     <w:unhideWhenUsed/>
     <w:qFormat/>
-    <w:rsid w:val="00C756EF"/>
+    <w:rsid w:val="00BA2A10"/>
     <w:pPr>
       <w:keepNext/>
       <w:keepLines/>
@@ -35087,7 +35110,7 @@
     <w:semiHidden/>
     <w:unhideWhenUsed/>
     <w:qFormat/>
-    <w:rsid w:val="00C756EF"/>
+    <w:rsid w:val="00BA2A10"/>
     <w:pPr>
       <w:keepNext/>
       <w:keepLines/>
@@ -35110,7 +35133,7 @@
     <w:semiHidden/>
     <w:unhideWhenUsed/>
     <w:qFormat/>
-    <w:rsid w:val="00C756EF"/>
+    <w:rsid w:val="00BA2A10"/>
     <w:pPr>
       <w:keepNext/>
       <w:keepLines/>
@@ -35133,7 +35156,7 @@
     <w:semiHidden/>
     <w:unhideWhenUsed/>
     <w:qFormat/>
-    <w:rsid w:val="00C756EF"/>
+    <w:rsid w:val="00BA2A10"/>
     <w:pPr>
       <w:keepNext/>
       <w:keepLines/>
@@ -35154,7 +35177,7 @@
     <w:semiHidden/>
     <w:unhideWhenUsed/>
     <w:qFormat/>
-    <w:rsid w:val="00C756EF"/>
+    <w:rsid w:val="00BA2A10"/>
     <w:pPr>
       <w:keepNext/>
       <w:keepLines/>
@@ -35198,7 +35221,7 @@
     <w:basedOn w:val="a0"/>
     <w:link w:val="1"/>
     <w:uiPriority w:val="9"/>
-    <w:rsid w:val="00C756EF"/>
+    <w:rsid w:val="00BA2A10"/>
     <w:rPr>
       <w:rFonts w:ascii="Arial" w:eastAsia="黑体" w:hAnsi="Arial" w:cs="Arial"/>
       <w:b/>
@@ -35212,7 +35235,7 @@
     <w:basedOn w:val="a0"/>
     <w:link w:val="2"/>
     <w:uiPriority w:val="9"/>
-    <w:rsid w:val="00C756EF"/>
+    <w:rsid w:val="00BA2A10"/>
     <w:rPr>
       <w:rFonts w:ascii="Arial" w:eastAsia="黑体" w:hAnsi="Arial" w:cs="Arial"/>
       <w:b/>
@@ -35226,7 +35249,7 @@
     <w:basedOn w:val="a0"/>
     <w:link w:val="3"/>
     <w:uiPriority w:val="9"/>
-    <w:rsid w:val="00C756EF"/>
+    <w:rsid w:val="00BA2A10"/>
     <w:rPr>
       <w:rFonts w:ascii="Arial" w:eastAsia="黑体" w:hAnsi="Arial" w:cs="Arial"/>
       <w:b/>
@@ -35241,7 +35264,7 @@
     <w:link w:val="4"/>
     <w:uiPriority w:val="9"/>
     <w:semiHidden/>
-    <w:rsid w:val="00C756EF"/>
+    <w:rsid w:val="00BA2A10"/>
     <w:rPr>
       <w:rFonts w:cstheme="majorBidi"/>
       <w:color w:val="2F5496" w:themeColor="accent1" w:themeShade="BF"/>
@@ -35255,7 +35278,7 @@
     <w:link w:val="5"/>
     <w:uiPriority w:val="9"/>
     <w:semiHidden/>
-    <w:rsid w:val="00C756EF"/>
+    <w:rsid w:val="00BA2A10"/>
     <w:rPr>
       <w:rFonts w:cstheme="majorBidi"/>
       <w:color w:val="2F5496" w:themeColor="accent1" w:themeShade="BF"/>
@@ -35268,7 +35291,7 @@
     <w:link w:val="6"/>
     <w:uiPriority w:val="9"/>
     <w:semiHidden/>
-    <w:rsid w:val="00C756EF"/>
+    <w:rsid w:val="00BA2A10"/>
     <w:rPr>
       <w:rFonts w:cstheme="majorBidi"/>
       <w:b/>
@@ -35282,7 +35305,7 @@
     <w:link w:val="7"/>
     <w:uiPriority w:val="9"/>
     <w:semiHidden/>
-    <w:rsid w:val="00C756EF"/>
+    <w:rsid w:val="00BA2A10"/>
     <w:rPr>
       <w:rFonts w:cstheme="majorBidi"/>
       <w:b/>
@@ -35296,7 +35319,7 @@
     <w:link w:val="8"/>
     <w:uiPriority w:val="9"/>
     <w:semiHidden/>
-    <w:rsid w:val="00C756EF"/>
+    <w:rsid w:val="00BA2A10"/>
     <w:rPr>
       <w:rFonts w:cstheme="majorBidi"/>
       <w:color w:val="595959" w:themeColor="text1" w:themeTint="A6"/>
@@ -35308,7 +35331,7 @@
     <w:link w:val="9"/>
     <w:uiPriority w:val="9"/>
     <w:semiHidden/>
-    <w:rsid w:val="00C756EF"/>
+    <w:rsid w:val="00BA2A10"/>
     <w:rPr>
       <w:rFonts w:eastAsiaTheme="majorEastAsia" w:cstheme="majorBidi"/>
       <w:color w:val="595959" w:themeColor="text1" w:themeTint="A6"/>
@@ -35321,7 +35344,7 @@
     <w:link w:val="a4"/>
     <w:uiPriority w:val="10"/>
     <w:qFormat/>
-    <w:rsid w:val="00C756EF"/>
+    <w:rsid w:val="00BA2A10"/>
     <w:pPr>
       <w:spacing w:after="80" w:line="240" w:lineRule="auto"/>
       <w:contextualSpacing/>
@@ -35340,7 +35363,7 @@
     <w:basedOn w:val="a0"/>
     <w:link w:val="a3"/>
     <w:uiPriority w:val="10"/>
-    <w:rsid w:val="00C756EF"/>
+    <w:rsid w:val="00BA2A10"/>
     <w:rPr>
       <w:rFonts w:asciiTheme="majorHAnsi" w:eastAsiaTheme="majorEastAsia" w:hAnsiTheme="majorHAnsi" w:cstheme="majorBidi"/>
       <w:spacing w:val="-10"/>
@@ -35356,7 +35379,7 @@
     <w:link w:val="a6"/>
     <w:uiPriority w:val="11"/>
     <w:qFormat/>
-    <w:rsid w:val="00C756EF"/>
+    <w:rsid w:val="00BA2A10"/>
     <w:pPr>
       <w:numPr>
         <w:ilvl w:val="1"/>
@@ -35376,7 +35399,7 @@
     <w:basedOn w:val="a0"/>
     <w:link w:val="a5"/>
     <w:uiPriority w:val="11"/>
-    <w:rsid w:val="00C756EF"/>
+    <w:rsid w:val="00BA2A10"/>
     <w:rPr>
       <w:rFonts w:asciiTheme="majorHAnsi" w:eastAsiaTheme="majorEastAsia" w:hAnsiTheme="majorHAnsi" w:cstheme="majorBidi"/>
       <w:color w:val="595959" w:themeColor="text1" w:themeTint="A6"/>
@@ -35392,7 +35415,7 @@
     <w:link w:val="a8"/>
     <w:uiPriority w:val="29"/>
     <w:qFormat/>
-    <w:rsid w:val="00C756EF"/>
+    <w:rsid w:val="00BA2A10"/>
     <w:pPr>
       <w:spacing w:before="160"/>
       <w:jc w:val="center"/>
@@ -35408,7 +35431,7 @@
     <w:basedOn w:val="a0"/>
     <w:link w:val="a7"/>
     <w:uiPriority w:val="29"/>
-    <w:rsid w:val="00C756EF"/>
+    <w:rsid w:val="00BA2A10"/>
     <w:rPr>
       <w:i/>
       <w:iCs/>
@@ -35420,7 +35443,7 @@
     <w:basedOn w:val="a"/>
     <w:uiPriority w:val="34"/>
     <w:qFormat/>
-    <w:rsid w:val="00C756EF"/>
+    <w:rsid w:val="00BA2A10"/>
     <w:pPr>
       <w:ind w:left="720"/>
       <w:contextualSpacing/>
@@ -35431,7 +35454,7 @@
     <w:basedOn w:val="a0"/>
     <w:uiPriority w:val="21"/>
     <w:qFormat/>
-    <w:rsid w:val="00C756EF"/>
+    <w:rsid w:val="00BA2A10"/>
     <w:rPr>
       <w:i/>
       <w:iCs/>
@@ -35445,7 +35468,7 @@
     <w:link w:val="ac"/>
     <w:uiPriority w:val="30"/>
     <w:qFormat/>
-    <w:rsid w:val="00C756EF"/>
+    <w:rsid w:val="00BA2A10"/>
     <w:pPr>
       <w:pBdr>
         <w:top w:val="single" w:sz="4" w:space="10" w:color="2F5496" w:themeColor="accent1" w:themeShade="BF"/>
@@ -35466,7 +35489,7 @@
     <w:basedOn w:val="a0"/>
     <w:link w:val="ab"/>
     <w:uiPriority w:val="30"/>
-    <w:rsid w:val="00C756EF"/>
+    <w:rsid w:val="00BA2A10"/>
     <w:rPr>
       <w:i/>
       <w:iCs/>
@@ -35478,7 +35501,7 @@
     <w:basedOn w:val="a0"/>
     <w:uiPriority w:val="32"/>
     <w:qFormat/>
-    <w:rsid w:val="00C756EF"/>
+    <w:rsid w:val="00BA2A10"/>
     <w:rPr>
       <w:b/>
       <w:bCs/>
@@ -35492,7 +35515,7 @@
     <w:basedOn w:val="a0"/>
     <w:uiPriority w:val="99"/>
     <w:unhideWhenUsed/>
-    <w:rsid w:val="00C756EF"/>
+    <w:rsid w:val="00BA2A10"/>
     <w:rPr>
       <w:color w:val="0563C1" w:themeColor="hyperlink"/>
       <w:u w:val="single"/>
@@ -35504,7 +35527,7 @@
     <w:uiPriority w:val="99"/>
     <w:semiHidden/>
     <w:unhideWhenUsed/>
-    <w:rsid w:val="00C756EF"/>
+    <w:rsid w:val="00BA2A10"/>
     <w:rPr>
       <w:color w:val="605E5C"/>
       <w:shd w:val="clear" w:color="auto" w:fill="E1DFDD"/>
@@ -35516,7 +35539,7 @@
     <w:link w:val="af1"/>
     <w:uiPriority w:val="99"/>
     <w:unhideWhenUsed/>
-    <w:rsid w:val="00C756EF"/>
+    <w:rsid w:val="00BA2A10"/>
     <w:pPr>
       <w:tabs>
         <w:tab w:val="center" w:pos="4153"/>
@@ -35536,7 +35559,7 @@
     <w:basedOn w:val="a0"/>
     <w:link w:val="af0"/>
     <w:uiPriority w:val="99"/>
-    <w:rsid w:val="00C756EF"/>
+    <w:rsid w:val="00BA2A10"/>
     <w:rPr>
       <w:rFonts w:ascii="Consolas" w:eastAsia="宋体" w:hAnsi="Consolas"/>
       <w:sz w:val="18"/>
@@ -35549,7 +35572,7 @@
     <w:link w:val="af3"/>
     <w:uiPriority w:val="99"/>
     <w:unhideWhenUsed/>
-    <w:rsid w:val="00C756EF"/>
+    <w:rsid w:val="00BA2A10"/>
     <w:pPr>
       <w:tabs>
         <w:tab w:val="center" w:pos="4153"/>
@@ -35569,7 +35592,7 @@
     <w:basedOn w:val="a0"/>
     <w:link w:val="af2"/>
     <w:uiPriority w:val="99"/>
-    <w:rsid w:val="00C756EF"/>
+    <w:rsid w:val="00BA2A10"/>
     <w:rPr>
       <w:rFonts w:ascii="Consolas" w:eastAsia="宋体" w:hAnsi="Consolas"/>
       <w:sz w:val="18"/>
@@ -35582,7 +35605,7 @@
     <w:uiPriority w:val="99"/>
     <w:semiHidden/>
     <w:unhideWhenUsed/>
-    <w:rsid w:val="00C756EF"/>
+    <w:rsid w:val="00BA2A10"/>
   </w:style>
   <w:style w:type="paragraph" w:styleId="TOC1">
     <w:name w:val="toc 1"/>
@@ -35591,7 +35614,7 @@
     <w:autoRedefine/>
     <w:uiPriority w:val="39"/>
     <w:unhideWhenUsed/>
-    <w:rsid w:val="00175A98"/>
+    <w:rsid w:val="008727F3"/>
   </w:style>
   <w:style w:type="paragraph" w:styleId="TOC2">
     <w:name w:val="toc 2"/>
@@ -35600,7 +35623,7 @@
     <w:autoRedefine/>
     <w:uiPriority w:val="39"/>
     <w:unhideWhenUsed/>
-    <w:rsid w:val="00175A98"/>
+    <w:rsid w:val="008727F3"/>
     <w:pPr>
       <w:ind w:leftChars="200" w:left="420"/>
     </w:pPr>
@@ -35612,7 +35635,7 @@
     <w:autoRedefine/>
     <w:uiPriority w:val="39"/>
     <w:unhideWhenUsed/>
-    <w:rsid w:val="00175A98"/>
+    <w:rsid w:val="008727F3"/>
     <w:pPr>
       <w:ind w:leftChars="400" w:left="840"/>
     </w:pPr>

</xml_diff>